<commit_message>
Cleanup: gitignore Drive metadata, archive accumulated deliverables and session logs
- gitignore: add .DS_Store and Google Drive Icon? patterns (repo now lives in
  Google Drive; Drive was injecting an Icon file in every folder)
- Remove tracked Drive cruft: .DS_Store (root + client-brief-refactor),
  app/api/admin/push-tbr-cold-sequences/Icon
- Archive accumulated deliverables and dossiers that had been sitting
  untracked at the repo root (Pixel_Pipeline_Flowchart, SA Spine content
  control board, SA Spine Campaign Buckets v2, VisitorID Intent Email
  Outreach Spec, MIGRATION-PASTE-THIS SQL helpers, Cyr/Kildoo dossiers)
- deliverables/: add TBR Email Nurture Sequence HTML, 04-25 FW cold session
  log, VisitorID/IntentID twin-funnel SVG and PNG; refresh SA Spine
  Campaign Buckets one-pager and Email Sequences docx
- Archive session logs from 04-07, 04-09, 04-13, 04-20
</commit_message>
<xml_diff>
--- a/deliverables/SA_Spine_Campaign_Buckets_OnePager.docx
+++ b/deliverables/SA_Spine_Campaign_Buckets_OnePager.docx
@@ -23,12 +23,6 @@
         <w:gridCol w:w="10080"/>
       </w:tblGrid>
       <w:tr>
-        <w:tblPrEx>
-          <w:tblCellMar>
-            <w:top w:w="0" w:type="dxa"/>
-            <w:bottom w:w="0" w:type="dxa"/>
-          </w:tblCellMar>
-        </w:tblPrEx>
         <w:tc>
           <w:tcPr>
             <w:tcW w:w="10080" w:type="dxa"/>
@@ -199,12 +193,6 @@
         <w:gridCol w:w="10080"/>
       </w:tblGrid>
       <w:tr>
-        <w:tblPrEx>
-          <w:tblCellMar>
-            <w:top w:w="0" w:type="dxa"/>
-            <w:bottom w:w="0" w:type="dxa"/>
-          </w:tblCellMar>
-        </w:tblPrEx>
         <w:tc>
           <w:tcPr>
             <w:tcW w:w="10080" w:type="dxa"/>
@@ -263,12 +251,6 @@
         </w:tc>
       </w:tr>
       <w:tr>
-        <w:tblPrEx>
-          <w:tblCellMar>
-            <w:top w:w="0" w:type="dxa"/>
-            <w:bottom w:w="0" w:type="dxa"/>
-          </w:tblCellMar>
-        </w:tblPrEx>
         <w:tc>
           <w:tcPr>
             <w:tcW w:w="10080" w:type="dxa"/>
@@ -507,12 +489,6 @@
         <w:gridCol w:w="10080"/>
       </w:tblGrid>
       <w:tr>
-        <w:tblPrEx>
-          <w:tblCellMar>
-            <w:top w:w="0" w:type="dxa"/>
-            <w:bottom w:w="0" w:type="dxa"/>
-          </w:tblCellMar>
-        </w:tblPrEx>
         <w:tc>
           <w:tcPr>
             <w:tcW w:w="10080" w:type="dxa"/>
@@ -571,12 +547,6 @@
         </w:tc>
       </w:tr>
       <w:tr>
-        <w:tblPrEx>
-          <w:tblCellMar>
-            <w:top w:w="0" w:type="dxa"/>
-            <w:bottom w:w="0" w:type="dxa"/>
-          </w:tblCellMar>
-        </w:tblPrEx>
         <w:tc>
           <w:tcPr>
             <w:tcW w:w="10080" w:type="dxa"/>
@@ -815,12 +785,6 @@
         <w:gridCol w:w="10080"/>
       </w:tblGrid>
       <w:tr>
-        <w:tblPrEx>
-          <w:tblCellMar>
-            <w:top w:w="0" w:type="dxa"/>
-            <w:bottom w:w="0" w:type="dxa"/>
-          </w:tblCellMar>
-        </w:tblPrEx>
         <w:tc>
           <w:tcPr>
             <w:tcW w:w="10080" w:type="dxa"/>
@@ -879,12 +843,6 @@
         </w:tc>
       </w:tr>
       <w:tr>
-        <w:tblPrEx>
-          <w:tblCellMar>
-            <w:top w:w="0" w:type="dxa"/>
-            <w:bottom w:w="0" w:type="dxa"/>
-          </w:tblCellMar>
-        </w:tblPrEx>
         <w:tc>
           <w:tcPr>
             <w:tcW w:w="10080" w:type="dxa"/>
@@ -1123,12 +1081,6 @@
         <w:gridCol w:w="10080"/>
       </w:tblGrid>
       <w:tr>
-        <w:tblPrEx>
-          <w:tblCellMar>
-            <w:top w:w="0" w:type="dxa"/>
-            <w:bottom w:w="0" w:type="dxa"/>
-          </w:tblCellMar>
-        </w:tblPrEx>
         <w:tc>
           <w:tcPr>
             <w:tcW w:w="10080" w:type="dxa"/>
@@ -1187,12 +1139,6 @@
         </w:tc>
       </w:tr>
       <w:tr>
-        <w:tblPrEx>
-          <w:tblCellMar>
-            <w:top w:w="0" w:type="dxa"/>
-            <w:bottom w:w="0" w:type="dxa"/>
-          </w:tblCellMar>
-        </w:tblPrEx>
         <w:tc>
           <w:tcPr>
             <w:tcW w:w="10080" w:type="dxa"/>
@@ -1470,12 +1416,6 @@
         <w:gridCol w:w="10080"/>
       </w:tblGrid>
       <w:tr>
-        <w:tblPrEx>
-          <w:tblCellMar>
-            <w:top w:w="0" w:type="dxa"/>
-            <w:bottom w:w="0" w:type="dxa"/>
-          </w:tblCellMar>
-        </w:tblPrEx>
         <w:tc>
           <w:tcPr>
             <w:tcW w:w="10080" w:type="dxa"/>
@@ -1534,12 +1474,6 @@
         </w:tc>
       </w:tr>
       <w:tr>
-        <w:tblPrEx>
-          <w:tblCellMar>
-            <w:top w:w="0" w:type="dxa"/>
-            <w:bottom w:w="0" w:type="dxa"/>
-          </w:tblCellMar>
-        </w:tblPrEx>
         <w:tc>
           <w:tcPr>
             <w:tcW w:w="10080" w:type="dxa"/>
@@ -1778,12 +1712,6 @@
         <w:gridCol w:w="10080"/>
       </w:tblGrid>
       <w:tr>
-        <w:tblPrEx>
-          <w:tblCellMar>
-            <w:top w:w="0" w:type="dxa"/>
-            <w:bottom w:w="0" w:type="dxa"/>
-          </w:tblCellMar>
-        </w:tblPrEx>
         <w:tc>
           <w:tcPr>
             <w:tcW w:w="10080" w:type="dxa"/>
@@ -1842,12 +1770,6 @@
         </w:tc>
       </w:tr>
       <w:tr>
-        <w:tblPrEx>
-          <w:tblCellMar>
-            <w:top w:w="0" w:type="dxa"/>
-            <w:bottom w:w="0" w:type="dxa"/>
-          </w:tblCellMar>
-        </w:tblPrEx>
         <w:tc>
           <w:tcPr>
             <w:tcW w:w="10080" w:type="dxa"/>

</xml_diff>